<commit_message>
build(dist): full PDF + Word deliverables (chapters, CĐ, P3-P8, refs)
20 .docx (native Word equations) + 20 .pdf (XeLaTeX/FreeSerif, 0 missing
glyphs) for all thesis documents and companion manuscripts.

https://claude.ai/code/session_01TqgqRfCDLY39798jcQXCr9
</commit_message>
<xml_diff>
--- a/dist/downloads/CD1_chuyen_de_1.docx
+++ b/dist/downloads/CD1_chuyen_de_1.docx
@@ -6524,7 +6524,31 @@
         <w:t xml:space="preserve">mở rộng có điều kiện</w:t>
       </w:r>
       <w:r>
-        <w:t xml:space="preserve">: tương tác DAI×FSTS² dương mạnh (β = 3,119, p = 0,005), Tier 1+2 là đòn bẩy.</w:t>
+        <w:t xml:space="preserve">: tương tác DAI×</w:t>
+      </w:r>
+      <m:oMath>
+        <m:sSup>
+          <m:e>
+            <m:r>
+              <m:rPr>
+                <m:nor/>
+                <m:sty m:val="p"/>
+              </m:rPr>
+              <m:t>FSTS</m:t>
+            </m:r>
+          </m:e>
+          <m:sup>
+            <m:r>
+              <m:t>2</m:t>
+            </m:r>
+          </m:sup>
+        </m:sSup>
+      </m:oMath>
+      <w:r>
+        <w:t xml:space="preserve"> </w:t>
+      </w:r>
+      <w:r>
+        <w:t xml:space="preserve">dương mạnh (β = 3,119, p = 0,005), Tier 1+2 là đòn bẩy.</w:t>
       </w:r>
     </w:p>
     <w:p>
@@ -15099,7 +15123,57 @@
         <w:t xml:space="preserve"> </w:t>
       </w:r>
       <w:r>
-        <w:t xml:space="preserve">của nhóm Advanced đổi mới sáng tạo dẫn dắt. Theo nghiên cứu Singapore (Mar, Đỗ &amp; Phan, 2026, MIR under review): R² hiệu chỉnh = 0,196; tương tác FSTS² × DAI = 3,119 (p = 0,005); điểm uốn ~88,6%.</w:t>
+        <w:t xml:space="preserve">của nhóm Advanced đổi mới sáng tạo dẫn dắt. Theo nghiên cứu Singapore (Mar, Đỗ &amp; Phan, 2026, MIR under review):</w:t>
+      </w:r>
+      <w:r>
+        <w:t xml:space="preserve"> </w:t>
+      </w:r>
+      <m:oMath>
+        <m:sSup>
+          <m:e>
+            <m:r>
+              <m:t>R</m:t>
+            </m:r>
+          </m:e>
+          <m:sup>
+            <m:r>
+              <m:t>2</m:t>
+            </m:r>
+          </m:sup>
+        </m:sSup>
+      </m:oMath>
+      <w:r>
+        <w:t xml:space="preserve"> </w:t>
+      </w:r>
+      <w:r>
+        <w:t xml:space="preserve">hiệu chỉnh = 0,196; tương tác</w:t>
+      </w:r>
+      <w:r>
+        <w:t xml:space="preserve"> </w:t>
+      </w:r>
+      <m:oMath>
+        <m:sSup>
+          <m:e>
+            <m:r>
+              <m:rPr>
+                <m:nor/>
+                <m:sty m:val="p"/>
+              </m:rPr>
+              <m:t>FSTS</m:t>
+            </m:r>
+          </m:e>
+          <m:sup>
+            <m:r>
+              <m:t>2</m:t>
+            </m:r>
+          </m:sup>
+        </m:sSup>
+      </m:oMath>
+      <w:r>
+        <w:t xml:space="preserve"> </w:t>
+      </w:r>
+      <w:r>
+        <w:t xml:space="preserve">× DAI = 3,119 (p = 0,005); điểm uốn ~88,6%.</w:t>
       </w:r>
     </w:p>
     <w:p>
@@ -17894,7 +17968,31 @@
         <w:t xml:space="preserve"> </w:t>
       </w:r>
       <w:r>
-        <w:t xml:space="preserve">(năm 5+): Phần bù năng suất. Bằng chứng: Trung Quốc R&amp;D 39,4% (Tier-2 mature); FSTS²×DAI = +3,119 (p = 0,005) tại Singapore, DAI khuếch đại quan hệ quốc tế hóa – hiệu quả tại doanh nghiệp FSTS cao.</w:t>
+        <w:t xml:space="preserve">(năm 5+): Phần bù năng suất. Bằng chứng: Trung Quốc R&amp;D 39,4% (Tier-2 mature);</w:t>
+      </w:r>
+      <w:r>
+        <w:t xml:space="preserve"> </w:t>
+      </w:r>
+      <m:oMath>
+        <m:sSup>
+          <m:e>
+            <m:r>
+              <m:rPr>
+                <m:nor/>
+                <m:sty m:val="p"/>
+              </m:rPr>
+              <m:t>FSTS</m:t>
+            </m:r>
+          </m:e>
+          <m:sup>
+            <m:r>
+              <m:t>2</m:t>
+            </m:r>
+          </m:sup>
+        </m:sSup>
+      </m:oMath>
+      <w:r>
+        <w:t xml:space="preserve">×DAI = +3,119 (p = 0,005) tại Singapore, DAI khuếch đại quan hệ quốc tế hóa – hiệu quả tại doanh nghiệp FSTS cao.</w:t>
       </w:r>
     </w:p>
     <w:p>
@@ -18409,7 +18507,31 @@
         <w:t xml:space="preserve">(3) Giao diện Đổi mới-Hiệu suất Nâng cao (AIPI)</w:t>
       </w:r>
       <w:r>
-        <w:t xml:space="preserve">: FSTS²×DAI = +3,119 tại Singapore gợi ý cơ chế mới, tại FSTS cao, doanh nghiệp cần DAI như</w:t>
+        <w:t xml:space="preserve">:</w:t>
+      </w:r>
+      <w:r>
+        <w:t xml:space="preserve"> </w:t>
+      </w:r>
+      <m:oMath>
+        <m:sSup>
+          <m:e>
+            <m:r>
+              <m:rPr>
+                <m:nor/>
+                <m:sty m:val="p"/>
+              </m:rPr>
+              <m:t>FSTS</m:t>
+            </m:r>
+          </m:e>
+          <m:sup>
+            <m:r>
+              <m:t>2</m:t>
+            </m:r>
+          </m:sup>
+        </m:sSup>
+      </m:oMath>
+      <w:r>
+        <w:t xml:space="preserve">×DAI = +3,119 tại Singapore gợi ý cơ chế mới, tại FSTS cao, doanh nghiệp cần DAI như</w:t>
       </w:r>
       <w:r>
         <w:t xml:space="preserve"> </w:t>

</xml_diff>

<commit_message>
build(dist): rebuild all submission deliverables from finalized sources
Regenerate DOCX + PDF (pandoc + xelatex, CTU reference templates) for the
complete submit-ready set, reflecting the voiced/clean-Vietnamese sources:
- P3-P8 manuscripts (EN + VI)
- Chuyên đề 1 & 2
- Luận án 5 chương (chương 1-5)
- References (APA7)

40 files (20 DOCX + 20 PDF) under dist/downloads/.

https://claude.ai/code/session_01TNqoRFY1vAVQL6GWg8X9M3
</commit_message>
<xml_diff>
--- a/dist/downloads/CD1_chuyen_de_1.docx
+++ b/dist/downloads/CD1_chuyen_de_1.docx
@@ -6980,7 +6980,7 @@
               <w:t xml:space="preserve"> </w:t>
             </w:r>
             <w:r>
-              <w:t xml:space="preserve">| Advanced, innovation-driven | Singapore, Hong Kong SAR, Hàn Quốc, Đài Loan, Israel | ~4.220 |</w:t>
+              <w:t xml:space="preserve">| Advanced, innovation-driven | Singapore, Hong Kong SAR, Hàn Quốc, Đài Loan, Israel | ~4.708 |</w:t>
             </w:r>
             <w:r>
               <w:t xml:space="preserve"> </w:t>
@@ -7146,7 +7146,7 @@
                 <w:iCs/>
                 <w:i/>
               </w:rPr>
-              <w:t xml:space="preserve">Ghi chú: n_firms là phân bố xấp xỉ theo pool 101.185; tổng 5 nhóm chính (I-V) = 99.814 (phạm vi chính 41 nước châu Á); SIDS Nhóm VI = 1.371 (1,4% pool).</w:t>
+              <w:t xml:space="preserve">Ghi chú: n_firms là phân bố theo pool 101.185; tổng 5 nhóm chính (I-V) = 99.814 (phạm vi chính 41 nước châu Á); SIDS Nhóm VI = 1.371 (1,4% pool). Nhóm Advanced (I + II = 6.640) lấy từ pool WBES đã hài hòa hóa; tỷ lệ innovation/resource là xấp xỉ, hao hụt do thiếu dữ liệu năng suất chi tiết ở Bảng 2.3.3.1 (mẫu phân tích Advanced gộp = 5.921).</w:t>
             </w:r>
           </w:p>
         </w:tc>

</xml_diff>

<commit_message>
build: regenerate dist/downloads dissertation + manuscript artifacts (G2 numbers)
Rebuilt 22 DOCX + 20 PDF from updated source via build_ctu_docx.sh: 5 thesis
chapters, CĐ1/CĐ2, P3–P8 manuscripts (EN+VI), references — now carrying the
P7 geographical-Asia (G2) figures.

https://claude.ai/code/session_01TNqoRFY1vAVQL6GWg8X9M3
</commit_message>
<xml_diff>
--- a/dist/downloads/CD1_chuyen_de_1.docx
+++ b/dist/downloads/CD1_chuyen_de_1.docx
@@ -318,13 +318,26 @@
           <w:bCs/>
           <w:b/>
         </w:rPr>
-        <w:t xml:space="preserve">chi phí buộc phải quốc tế hóa</w:t>
-      </w:r>
-      <w:r>
-        <w:t xml:space="preserve"> </w:t>
-      </w:r>
-      <w:r>
-        <w:t xml:space="preserve">ở 7 SIDS Thái Bình Dương, đóng góp định hướng cho luận án và Chuyên đề tiến sĩ số 2.</w:t>
+        <w:t xml:space="preserve">gánh nặng quốc tế hóa bắt buộc (Forced Internationalization Penalty — FIP)</w:t>
+      </w:r>
+      <w:r>
+        <w:t xml:space="preserve"> </w:t>
+      </w:r>
+      <w:r>
+        <w:t xml:space="preserve">ở 7 SIDS Thái Bình Dương. Đọc tổng thể, bảy tiểu cảnh không phải các trường hợp rời rạc mà là các vùng trên một</w:t>
+      </w:r>
+      <w:r>
+        <w:t xml:space="preserve"> </w:t>
+      </w:r>
+      <w:r>
+        <w:rPr>
+          <w:bCs/>
+          <w:b/>
+        </w:rPr>
+        <w:t xml:space="preserve">bản đồ địa hình xuất khẩu chiến lược (strategic export topography)</w:t>
+      </w:r>
+      <w:r>
+        <w:t xml:space="preserve">, trên đó chế độ thể chế ICRV vận hành như một bộ lọc chi phí giao dịch định vị nơi hiệu quả quốc tế hóa đạt đỉnh hay sụp đổ; phát hiện này đóng góp định hướng cho luận án và Chuyên đề tiến sĩ số 2.</w:t>
       </w:r>
     </w:p>
     <w:p>

</xml_diff>